<commit_message>
Rechnungstexte an die DATEV-Vorlage angepasst: beide Gewährleistungssätze, Fußzeile mit HRB
Co-Authored-By: Claude Opus 5.5 <noreply@anthropic.com>
Claude-Session: https://claude.ai/code/session_01576f22PxULmPRwq5ayso6w
</commit_message>
<xml_diff>
--- a/ausgabe/S2_Verkauf_Ablauf_und_Texte.docx
+++ b/ausgabe/S2_Verkauf_Ablauf_und_Texte.docx
@@ -1116,18 +1116,6 @@
               <w:t>Es handelt sich um gebrauchte Gegenstände, verkauft im vorhandenen Zustand.</w:t>
             </w:r>
           </w:p>
-          <w:p>
-            <w:pPr>
-              <w:spacing w:after="60"/>
-            </w:pPr>
-            <w:r>
-              <w:rPr>
-                <w:rFonts w:ascii="Arial" w:hAnsi="Arial"/>
-                <w:sz w:val="19"/>
-              </w:rPr>
-              <w:t>Leistungsdatum: Tag der Abholung am __.__.2026.</w:t>
-            </w:r>
-          </w:p>
         </w:tc>
       </w:tr>
     </w:tbl>
@@ -1143,53 +1131,7 @@
           <w:color w:val="1A1A1A"/>
           <w:sz w:val="20"/>
         </w:rPr>
-        <w:t>Zusatz nur bei Unternehmen</w:t>
-      </w:r>
-    </w:p>
-    <w:tbl>
-      <w:tblPr>
-        <w:tblStyle w:val="TableGrid"/>
-        <w:tblW w:type="auto" w:w="0"/>
-        <w:tblLook w:firstColumn="1" w:firstRow="1" w:lastColumn="0" w:lastRow="0" w:noHBand="0" w:noVBand="1" w:val="04A0"/>
-      </w:tblPr>
-      <w:tblGrid>
-        <w:gridCol w:w="9518"/>
-      </w:tblGrid>
-      <w:tr>
-        <w:tc>
-          <w:tcPr>
-            <w:tcW w:type="dxa" w:w="9518"/>
-            <w:shd w:val="clear" w:color="auto" w:fill="F2F2F2"/>
-          </w:tcPr>
-          <w:p>
-            <w:pPr>
-              <w:spacing w:after="60"/>
-            </w:pPr>
-            <w:r/>
-            <w:r>
-              <w:rPr>
-                <w:rFonts w:ascii="Arial" w:hAnsi="Arial"/>
-                <w:sz w:val="19"/>
-              </w:rPr>
-              <w:t>Die Gewährleistung für Sach- und Rechtsmängel ist ausgeschlossen.</w:t>
-            </w:r>
-          </w:p>
-        </w:tc>
-      </w:tr>
-    </w:tbl>
-    <w:p>
-      <w:pPr>
-        <w:spacing w:before="120" w:after="40"/>
-      </w:pPr>
-      <w:r>
-        <w:rPr>
-          <w:rFonts w:ascii="Arial" w:hAnsi="Arial"/>
-          <w:b/>
-          <w:i w:val="0"/>
-          <w:color w:val="1A1A1A"/>
-          <w:sz w:val="20"/>
-        </w:rPr>
-        <w:t>Zusatz nur bei Privatpersonen</w:t>
+        <w:t>Gewährleistung (beide Sätze stehen auf jeder Rechnung)</w:t>
       </w:r>
     </w:p>
     <w:tbl>
@@ -1218,6 +1160,18 @@
                 <w:sz w:val="19"/>
               </w:rPr>
               <w:t>Für Verbraucher gelten die gesetzlichen Bestimmungen; die Verjährungsfrist für Mängelansprüche beträgt gemäß der gesonderten Vereinbarung in Ihrer Bestellung ein Jahr ab Übergabe. Über Ihr gesetzliches Widerrufsrecht informiert Sie die Widerrufsbelehrung in Ihrer Bestellung.</w:t>
+            </w:r>
+          </w:p>
+          <w:p>
+            <w:pPr>
+              <w:spacing w:after="60"/>
+            </w:pPr>
+            <w:r>
+              <w:rPr>
+                <w:rFonts w:ascii="Arial" w:hAnsi="Arial"/>
+                <w:sz w:val="19"/>
+              </w:rPr>
+              <w:t>Bei Unternehmen: Die Gewährleistung für Sach- und Rechtsmängel ist ausgeschlossen.</w:t>
             </w:r>
           </w:p>
         </w:tc>
@@ -1317,6 +1271,79 @@
         </w:tc>
       </w:tr>
     </w:tbl>
+    <w:p>
+      <w:pPr>
+        <w:spacing w:before="120" w:after="40"/>
+      </w:pPr>
+      <w:r>
+        <w:rPr>
+          <w:rFonts w:ascii="Arial" w:hAnsi="Arial"/>
+          <w:b/>
+          <w:i w:val="0"/>
+          <w:color w:val="1A1A1A"/>
+          <w:sz w:val="20"/>
+        </w:rPr>
+        <w:t>Fußzeile (Pflicht für die GmbH, § 35a GmbHG)</w:t>
+      </w:r>
+    </w:p>
+    <w:tbl>
+      <w:tblPr>
+        <w:tblStyle w:val="TableGrid"/>
+        <w:tblW w:type="auto" w:w="0"/>
+        <w:tblLook w:firstColumn="1" w:firstRow="1" w:lastColumn="0" w:lastRow="0" w:noHBand="0" w:noVBand="1" w:val="04A0"/>
+      </w:tblPr>
+      <w:tblGrid>
+        <w:gridCol w:w="9518"/>
+      </w:tblGrid>
+      <w:tr>
+        <w:tc>
+          <w:tcPr>
+            <w:tcW w:type="dxa" w:w="9518"/>
+            <w:shd w:val="clear" w:color="auto" w:fill="F2F2F2"/>
+          </w:tcPr>
+          <w:p>
+            <w:pPr>
+              <w:spacing w:after="60"/>
+            </w:pPr>
+            <w:r/>
+            <w:r>
+              <w:rPr>
+                <w:rFonts w:ascii="Arial" w:hAnsi="Arial"/>
+                <w:sz w:val="19"/>
+              </w:rPr>
+              <w:t>Sitz: Villingen-Schwenningen · Amtsgericht Freiburg i. Br. HRB 707915 · Geschäftsführung: Marisa Faißt-Neininger</w:t>
+            </w:r>
+          </w:p>
+          <w:p>
+            <w:pPr>
+              <w:spacing w:after="60"/>
+            </w:pPr>
+            <w:r>
+              <w:rPr>
+                <w:rFonts w:ascii="Arial" w:hAnsi="Arial"/>
+                <w:sz w:val="19"/>
+              </w:rPr>
+              <w:t>Steuernummer und/oder USt-IdNr. (mindestens eine davon ist Pflicht)</w:t>
+            </w:r>
+          </w:p>
+        </w:tc>
+      </w:tr>
+    </w:tbl>
+    <w:p>
+      <w:pPr>
+        <w:spacing w:before="80" w:after="140"/>
+      </w:pPr>
+      <w:r>
+        <w:rPr>
+          <w:rFonts w:ascii="Arial" w:hAnsi="Arial"/>
+          <w:b w:val="0"/>
+          <w:i/>
+          <w:color w:val="1A1A1A"/>
+          <w:sz w:val="19"/>
+        </w:rPr>
+        <w:t>Lieferdatum im Rechnungskopf = Abholtag. Eine Zeile je Artikelnummer, Stückzahl in die Spalte Menge.</w:t>
+      </w:r>
+    </w:p>
     <w:p>
       <w:pPr>
         <w:spacing w:before="200" w:after="40"/>

</xml_diff>

<commit_message>
Mail-Vorlage an den Käufer: Wortlaut der Nutzerin mit Zufahrt, Sie- und Du-Form
Co-Authored-By: Claude Opus 5.5 <noreply@anthropic.com>
Claude-Session: https://claude.ai/code/session_01576f22PxULmPRwq5ayso6w
</commit_message>
<xml_diff>
--- a/ausgabe/S2_Verkauf_Ablauf_und_Texte.docx
+++ b/ausgabe/S2_Verkauf_Ablauf_und_Texte.docx
@@ -1451,7 +1451,7 @@
           <w:color w:val="1A1A1A"/>
           <w:sz w:val="20"/>
         </w:rPr>
-        <w:t>Unternehmen</w:t>
+        <w:t>Sie – Privatperson</w:t>
       </w:r>
     </w:p>
     <w:tbl>
@@ -1502,7 +1502,7 @@
                 <w:rFonts w:ascii="Arial" w:hAnsi="Arial"/>
                 <w:sz w:val="19"/>
               </w:rPr>
-              <w:t>Guten Tag [Name],</w:t>
+              <w:t>Guten Tag [Frau/Herr Name],</w:t>
             </w:r>
           </w:p>
           <w:p>
@@ -1548,7 +1548,7 @@
                 <w:rFonts w:ascii="Arial" w:hAnsi="Arial"/>
                 <w:sz w:val="19"/>
               </w:rPr>
-              <w:t>Bitte überweisen Sie den Betrag von [Betrag] € bis spätestens [Datum] unter Angabe der Rechnungsnummer. Die Bestellung senden Sie uns bitte unterschrieben per Scan zurück oder unterschreiben sie bei der Abholung.</w:t>
+              <w:t>Bitte überweisen Sie den Rechnungsbetrag zeitnah unter Angabe der Rechnungsnummer auf das angegebene Konto. Die Bestellung senden Sie uns bitte unterschrieben per Scan zurück oder unterschreiben sie bei der Abholung.</w:t>
             </w:r>
           </w:p>
           <w:p>
@@ -1571,7 +1571,18 @@
                 <w:rFonts w:ascii="Arial" w:hAnsi="Arial"/>
                 <w:sz w:val="19"/>
               </w:rPr>
-              <w:t>Ihr Abholtermin: [Montag/Dienstag], [Datum], [Uhrzeit] Uhr</w:t>
+              <w:t>Ihr Abholtermin am [Wochentag], [Datum] um [Uhrzeit] Uhr ist mit dem Zahlungseingang bestätigt – die Ware geben wir erst nach Zahlungseingang heraus.</w:t>
+            </w:r>
+          </w:p>
+          <w:p>
+            <w:pPr>
+              <w:spacing w:after="60"/>
+            </w:pPr>
+            <w:r>
+              <w:rPr>
+                <w:rFonts w:ascii="Arial" w:hAnsi="Arial"/>
+                <w:sz w:val="19"/>
+              </w:rPr>
             </w:r>
           </w:p>
           <w:p>
@@ -1595,7 +1606,42 @@
                 <w:rFonts w:ascii="Arial" w:hAnsi="Arial"/>
                 <w:sz w:val="19"/>
               </w:rPr>
-              <w:t>Die Ware wird nach Zahlungseingang herausgegeben. Bitte bringen Sie ausreichend Helfer, Werkzeug und ein passendes Fahrzeug mit.</w:t>
+              <w:t>Die Zufahrt ist nur über die Peterzeller Straße 8 möglich: am Firmengelände vorbei bis ans Ende durchfahren, das Gebäude liegt auf der rechten Seite.</w:t>
+            </w:r>
+          </w:p>
+          <w:p>
+            <w:pPr>
+              <w:spacing w:after="60"/>
+            </w:pPr>
+            <w:r>
+              <w:rPr>
+                <w:rFonts w:ascii="Arial" w:hAnsi="Arial"/>
+                <w:sz w:val="19"/>
+              </w:rPr>
+              <w:t>Bitte bringen Sie ausreichend Helfer, Werkzeug und ein passendes Fahrzeug mit.</w:t>
+            </w:r>
+          </w:p>
+          <w:p>
+            <w:pPr>
+              <w:spacing w:after="60"/>
+            </w:pPr>
+            <w:r>
+              <w:rPr>
+                <w:rFonts w:ascii="Arial" w:hAnsi="Arial"/>
+                <w:sz w:val="19"/>
+              </w:rPr>
+            </w:r>
+          </w:p>
+          <w:p>
+            <w:pPr>
+              <w:spacing w:after="60"/>
+            </w:pPr>
+            <w:r>
+              <w:rPr>
+                <w:rFonts w:ascii="Arial" w:hAnsi="Arial"/>
+                <w:sz w:val="19"/>
+              </w:rPr>
+              <w:t>Die Widerrufsbelehrung und das Widerrufsformular finden Sie in der beigefügten Bestellung.</w:t>
             </w:r>
           </w:p>
           <w:p>
@@ -1683,7 +1729,7 @@
           <w:color w:val="1A1A1A"/>
           <w:sz w:val="20"/>
         </w:rPr>
-        <w:t>Privatperson</w:t>
+        <w:t>Du – Privatperson</w:t>
       </w:r>
     </w:p>
     <w:tbl>
@@ -1711,7 +1757,7 @@
                 <w:rFonts w:ascii="Arial" w:hAnsi="Arial"/>
                 <w:sz w:val="19"/>
               </w:rPr>
-              <w:t>Betreff: Ihre Bestellung Nr. [Vorgang] – Rechnung und Abholtermin</w:t>
+              <w:t>Betreff: Deine Bestellung Nr. [Vorgang] – Rechnung und Abholtermin</w:t>
             </w:r>
           </w:p>
           <w:p>
@@ -1734,7 +1780,7 @@
                 <w:rFonts w:ascii="Arial" w:hAnsi="Arial"/>
                 <w:sz w:val="19"/>
               </w:rPr>
-              <w:t>Guten Tag [Name],</w:t>
+              <w:t>Hallo [Vorname],</w:t>
             </w:r>
           </w:p>
           <w:p>
@@ -1757,7 +1803,7 @@
                 <w:rFonts w:ascii="Arial" w:hAnsi="Arial"/>
                 <w:sz w:val="19"/>
               </w:rPr>
-              <w:t>vielen Dank für Ihre Reservierung. Anbei erhalten Sie die Rechnung Nr. [Rechnungsnr.] und Ihre Bestellung.</w:t>
+              <w:t>vielen Dank für deine Reservierung! Anbei findest du die Rechnung Nr. [Rechnungsnr.] und deine Bestellung.</w:t>
             </w:r>
           </w:p>
           <w:p>
@@ -1780,7 +1826,7 @@
                 <w:rFonts w:ascii="Arial" w:hAnsi="Arial"/>
                 <w:sz w:val="19"/>
               </w:rPr>
-              <w:t>Bitte überweisen Sie den Betrag von [Betrag] € bis spätestens [Datum] unter Angabe der Rechnungsnummer. Die Bestellung senden Sie uns bitte unterschrieben per Scan zurück oder unterschreiben sie bei der Abholung.</w:t>
+              <w:t>Bitte überweise den Rechnungsbetrag zeitnah unter Angabe der Rechnungsnummer auf das angegebene Konto. Die Bestellung kannst du uns unterschrieben per Scan zurückschicken oder bei der Abholung unterschreiben.</w:t>
             </w:r>
           </w:p>
           <w:p>
@@ -1803,7 +1849,18 @@
                 <w:rFonts w:ascii="Arial" w:hAnsi="Arial"/>
                 <w:sz w:val="19"/>
               </w:rPr>
-              <w:t>Ihr Abholtermin: [Montag/Dienstag], [Datum], [Uhrzeit] Uhr</w:t>
+              <w:t>Dein Abholtermin am [Wochentag], [Datum] um [Uhrzeit] Uhr ist mit dem Zahlungseingang bestätigt – die Ware geben wir erst nach Zahlungseingang heraus.</w:t>
+            </w:r>
+          </w:p>
+          <w:p>
+            <w:pPr>
+              <w:spacing w:after="60"/>
+            </w:pPr>
+            <w:r>
+              <w:rPr>
+                <w:rFonts w:ascii="Arial" w:hAnsi="Arial"/>
+                <w:sz w:val="19"/>
+              </w:rPr>
             </w:r>
           </w:p>
           <w:p>
@@ -1827,7 +1884,19 @@
                 <w:rFonts w:ascii="Arial" w:hAnsi="Arial"/>
                 <w:sz w:val="19"/>
               </w:rPr>
-              <w:t>Die Ware wird nach Zahlungseingang herausgegeben. Bitte bringen Sie ausreichend Helfer, Werkzeug und ein passendes Fahrzeug mit.</w:t>
+              <w:t>Die Zufahrt ist nur über die Peterzeller Straße 8 möglich: am Firmengelände vorbei bis ans Ende durchfahren, das Gebäude liegt auf der rechten Seite.</w:t>
+            </w:r>
+          </w:p>
+          <w:p>
+            <w:pPr>
+              <w:spacing w:after="60"/>
+            </w:pPr>
+            <w:r>
+              <w:rPr>
+                <w:rFonts w:ascii="Arial" w:hAnsi="Arial"/>
+                <w:sz w:val="19"/>
+              </w:rPr>
+              <w:t>Bitte bring ausreichend Helfer, Werkzeug und ein passendes Fahrzeug mit.</w:t>
             </w:r>
           </w:p>
           <w:p>
@@ -1850,7 +1919,7 @@
                 <w:rFonts w:ascii="Arial" w:hAnsi="Arial"/>
                 <w:sz w:val="19"/>
               </w:rPr>
-              <w:t>Die Widerrufsbelehrung und das Widerrufsformular finden Sie in der beigefügten Bestellung. Bitte lesen Sie sie vor der Unterschrift.</w:t>
+              <w:t>Die Widerrufsbelehrung und das Widerrufsformular findest du in der beigefügten Bestellung.</w:t>
             </w:r>
           </w:p>
           <w:p>
@@ -1873,7 +1942,7 @@
                 <w:rFonts w:ascii="Arial" w:hAnsi="Arial"/>
                 <w:sz w:val="19"/>
               </w:rPr>
-              <w:t>Bei Fragen erreichen Sie uns unter 07725 5179702 oder saldi4kids@outlook.com.</w:t>
+              <w:t>Bei Fragen erreichst du uns unter 07725 5179702 oder saldi4kids@outlook.com.</w:t>
             </w:r>
           </w:p>
           <w:p>
@@ -1896,7 +1965,7 @@
                 <w:rFonts w:ascii="Arial" w:hAnsi="Arial"/>
                 <w:sz w:val="19"/>
               </w:rPr>
-              <w:t>Mit freundlichen Grüßen</w:t>
+              <w:t>Viele Grüße</w:t>
             </w:r>
           </w:p>
           <w:p>
@@ -1926,6 +1995,21 @@
         </w:tc>
       </w:tr>
     </w:tbl>
+    <w:p>
+      <w:pPr>
+        <w:spacing w:before="80" w:after="140"/>
+      </w:pPr>
+      <w:r>
+        <w:rPr>
+          <w:rFonts w:ascii="Arial" w:hAnsi="Arial"/>
+          <w:b w:val="0"/>
+          <w:i/>
+          <w:color w:val="1A1A1A"/>
+          <w:sz w:val="19"/>
+        </w:rPr>
+        <w:t>Bei Unternehmen: dieselbe Mail, nur ohne den Satz zur Widerrufsbelehrung.</w:t>
+      </w:r>
+    </w:p>
     <w:sectPr>
       <w:pgSz w:w="12240" w:h="15840"/>
       <w:pgMar w:top="1247" w:right="1361" w:bottom="1134" w:left="1361" w:header="720" w:footer="720" w:gutter="0"/>

</xml_diff>

<commit_message>
Mail-Vorlage für Unternehmen ergänzt
Co-Authored-By: Claude Opus 5.5 <noreply@anthropic.com>
Claude-Session: https://claude.ai/code/session_01576f22PxULmPRwq5ayso6w
</commit_message>
<xml_diff>
--- a/ausgabe/S2_Verkauf_Ablauf_und_Texte.docx
+++ b/ausgabe/S2_Verkauf_Ablauf_und_Texte.docx
@@ -1997,19 +1997,259 @@
     </w:tbl>
     <w:p>
       <w:pPr>
-        <w:spacing w:before="80" w:after="140"/>
+        <w:spacing w:before="120" w:after="40"/>
       </w:pPr>
       <w:r>
         <w:rPr>
           <w:rFonts w:ascii="Arial" w:hAnsi="Arial"/>
-          <w:b w:val="0"/>
-          <w:i/>
+          <w:b/>
+          <w:i w:val="0"/>
           <w:color w:val="1A1A1A"/>
-          <w:sz w:val="19"/>
+          <w:sz w:val="20"/>
         </w:rPr>
-        <w:t>Bei Unternehmen: dieselbe Mail, nur ohne den Satz zur Widerrufsbelehrung.</w:t>
+        <w:t>Unternehmen (ohne Widerrufsbelehrung – Firmen haben kein Widerrufsrecht)</w:t>
       </w:r>
     </w:p>
+    <w:tbl>
+      <w:tblPr>
+        <w:tblStyle w:val="TableGrid"/>
+        <w:tblW w:type="auto" w:w="0"/>
+        <w:tblLook w:firstColumn="1" w:firstRow="1" w:lastColumn="0" w:lastRow="0" w:noHBand="0" w:noVBand="1" w:val="04A0"/>
+      </w:tblPr>
+      <w:tblGrid>
+        <w:gridCol w:w="9518"/>
+      </w:tblGrid>
+      <w:tr>
+        <w:tc>
+          <w:tcPr>
+            <w:tcW w:type="dxa" w:w="9518"/>
+            <w:shd w:val="clear" w:color="auto" w:fill="F2F2F2"/>
+          </w:tcPr>
+          <w:p>
+            <w:pPr>
+              <w:spacing w:after="60"/>
+            </w:pPr>
+            <w:r/>
+            <w:r>
+              <w:rPr>
+                <w:rFonts w:ascii="Arial" w:hAnsi="Arial"/>
+                <w:sz w:val="19"/>
+              </w:rPr>
+              <w:t>Betreff: Ihre Bestellung Nr. [Vorgang] – Rechnung und Abholtermin</w:t>
+            </w:r>
+          </w:p>
+          <w:p>
+            <w:pPr>
+              <w:spacing w:after="60"/>
+            </w:pPr>
+            <w:r>
+              <w:rPr>
+                <w:rFonts w:ascii="Arial" w:hAnsi="Arial"/>
+                <w:sz w:val="19"/>
+              </w:rPr>
+            </w:r>
+          </w:p>
+          <w:p>
+            <w:pPr>
+              <w:spacing w:after="60"/>
+            </w:pPr>
+            <w:r>
+              <w:rPr>
+                <w:rFonts w:ascii="Arial" w:hAnsi="Arial"/>
+                <w:sz w:val="19"/>
+              </w:rPr>
+              <w:t>Sehr geehrte Damen und Herren, / Guten Tag [Frau/Herr Name],</w:t>
+            </w:r>
+          </w:p>
+          <w:p>
+            <w:pPr>
+              <w:spacing w:after="60"/>
+            </w:pPr>
+            <w:r>
+              <w:rPr>
+                <w:rFonts w:ascii="Arial" w:hAnsi="Arial"/>
+                <w:sz w:val="19"/>
+              </w:rPr>
+            </w:r>
+          </w:p>
+          <w:p>
+            <w:pPr>
+              <w:spacing w:after="60"/>
+            </w:pPr>
+            <w:r>
+              <w:rPr>
+                <w:rFonts w:ascii="Arial" w:hAnsi="Arial"/>
+                <w:sz w:val="19"/>
+              </w:rPr>
+              <w:t>vielen Dank für Ihre Reservierung aus unserem Artikelkatalog. Anbei erhalten Sie die Rechnung Nr. [Rechnungsnr.] und die Bestellung für [Firma].</w:t>
+            </w:r>
+          </w:p>
+          <w:p>
+            <w:pPr>
+              <w:spacing w:after="60"/>
+            </w:pPr>
+            <w:r>
+              <w:rPr>
+                <w:rFonts w:ascii="Arial" w:hAnsi="Arial"/>
+                <w:sz w:val="19"/>
+              </w:rPr>
+            </w:r>
+          </w:p>
+          <w:p>
+            <w:pPr>
+              <w:spacing w:after="60"/>
+            </w:pPr>
+            <w:r>
+              <w:rPr>
+                <w:rFonts w:ascii="Arial" w:hAnsi="Arial"/>
+                <w:sz w:val="19"/>
+              </w:rPr>
+              <w:t>Bitte überweisen Sie den Rechnungsbetrag zeitnah unter Angabe der Rechnungsnummer auf das angegebene Konto. Die Bestellung senden Sie uns bitte unterschrieben per Scan zurück oder unterschreiben sie bei der Abholung.</w:t>
+            </w:r>
+          </w:p>
+          <w:p>
+            <w:pPr>
+              <w:spacing w:after="60"/>
+            </w:pPr>
+            <w:r>
+              <w:rPr>
+                <w:rFonts w:ascii="Arial" w:hAnsi="Arial"/>
+                <w:sz w:val="19"/>
+              </w:rPr>
+            </w:r>
+          </w:p>
+          <w:p>
+            <w:pPr>
+              <w:spacing w:after="60"/>
+            </w:pPr>
+            <w:r>
+              <w:rPr>
+                <w:rFonts w:ascii="Arial" w:hAnsi="Arial"/>
+                <w:sz w:val="19"/>
+              </w:rPr>
+              <w:t>Ihr Abholtermin am [Wochentag], [Datum] um [Uhrzeit] Uhr ist mit dem Zahlungseingang bestätigt – die Ware geben wir erst nach Zahlungseingang heraus.</w:t>
+            </w:r>
+          </w:p>
+          <w:p>
+            <w:pPr>
+              <w:spacing w:after="60"/>
+            </w:pPr>
+            <w:r>
+              <w:rPr>
+                <w:rFonts w:ascii="Arial" w:hAnsi="Arial"/>
+                <w:sz w:val="19"/>
+              </w:rPr>
+            </w:r>
+          </w:p>
+          <w:p>
+            <w:pPr>
+              <w:spacing w:after="60"/>
+            </w:pPr>
+            <w:r>
+              <w:rPr>
+                <w:rFonts w:ascii="Arial" w:hAnsi="Arial"/>
+                <w:sz w:val="19"/>
+              </w:rPr>
+              <w:t>Abholadresse: Hermann-Schwer-Str. 1, 78048 Villingen-Schwenningen</w:t>
+            </w:r>
+          </w:p>
+          <w:p>
+            <w:pPr>
+              <w:spacing w:after="60"/>
+            </w:pPr>
+            <w:r>
+              <w:rPr>
+                <w:rFonts w:ascii="Arial" w:hAnsi="Arial"/>
+                <w:sz w:val="19"/>
+              </w:rPr>
+              <w:t>Die Zufahrt ist nur über die Peterzeller Straße 8 möglich: am Firmengelände vorbei bis ans Ende durchfahren, das Gebäude liegt auf der rechten Seite.</w:t>
+            </w:r>
+          </w:p>
+          <w:p>
+            <w:pPr>
+              <w:spacing w:after="60"/>
+            </w:pPr>
+            <w:r>
+              <w:rPr>
+                <w:rFonts w:ascii="Arial" w:hAnsi="Arial"/>
+                <w:sz w:val="19"/>
+              </w:rPr>
+              <w:t>Bitte bringen Sie ausreichend Helfer, Werkzeug und ein passendes Fahrzeug mit.</w:t>
+            </w:r>
+          </w:p>
+          <w:p>
+            <w:pPr>
+              <w:spacing w:after="60"/>
+            </w:pPr>
+            <w:r>
+              <w:rPr>
+                <w:rFonts w:ascii="Arial" w:hAnsi="Arial"/>
+                <w:sz w:val="19"/>
+              </w:rPr>
+            </w:r>
+          </w:p>
+          <w:p>
+            <w:pPr>
+              <w:spacing w:after="60"/>
+            </w:pPr>
+            <w:r>
+              <w:rPr>
+                <w:rFonts w:ascii="Arial" w:hAnsi="Arial"/>
+                <w:sz w:val="19"/>
+              </w:rPr>
+              <w:t>Bei Fragen erreichen Sie uns unter 07725 5179702 oder saldi4kids@outlook.com.</w:t>
+            </w:r>
+          </w:p>
+          <w:p>
+            <w:pPr>
+              <w:spacing w:after="60"/>
+            </w:pPr>
+            <w:r>
+              <w:rPr>
+                <w:rFonts w:ascii="Arial" w:hAnsi="Arial"/>
+                <w:sz w:val="19"/>
+              </w:rPr>
+            </w:r>
+          </w:p>
+          <w:p>
+            <w:pPr>
+              <w:spacing w:after="60"/>
+            </w:pPr>
+            <w:r>
+              <w:rPr>
+                <w:rFonts w:ascii="Arial" w:hAnsi="Arial"/>
+                <w:sz w:val="19"/>
+              </w:rPr>
+              <w:t>Mit freundlichen Grüßen</w:t>
+            </w:r>
+          </w:p>
+          <w:p>
+            <w:pPr>
+              <w:spacing w:after="60"/>
+            </w:pPr>
+            <w:r>
+              <w:rPr>
+                <w:rFonts w:ascii="Arial" w:hAnsi="Arial"/>
+                <w:sz w:val="19"/>
+              </w:rPr>
+              <w:t>[Name]</w:t>
+            </w:r>
+          </w:p>
+          <w:p>
+            <w:pPr>
+              <w:spacing w:after="60"/>
+            </w:pPr>
+            <w:r>
+              <w:rPr>
+                <w:rFonts w:ascii="Arial" w:hAnsi="Arial"/>
+                <w:sz w:val="19"/>
+              </w:rPr>
+              <w:t>Kikripp GmbH</w:t>
+            </w:r>
+          </w:p>
+        </w:tc>
+      </w:tr>
+    </w:tbl>
     <w:sectPr>
       <w:pgSz w:w="12240" w:h="15840"/>
       <w:pgMar w:top="1247" w:right="1361" w:bottom="1134" w:left="1361" w:header="720" w:footer="720" w:gutter="0"/>

</xml_diff>

<commit_message>
Vier Mailvorlagen (Sie/Du × Privat/Firma) mit möglichst wenig Platzhaltern
Co-Authored-By: Claude Opus 5.5 <noreply@anthropic.com>
Claude-Session: https://claude.ai/code/session_01576f22PxULmPRwq5ayso6w
</commit_message>
<xml_diff>
--- a/ausgabe/S2_Verkauf_Ablauf_und_Texte.docx
+++ b/ausgabe/S2_Verkauf_Ablauf_und_Texte.docx
@@ -1436,7 +1436,7 @@
           <w:color w:val="6B7280"/>
           <w:sz w:val="22"/>
         </w:rPr>
-        <w:t>Vorlage – Rechnung und Bestellung als PDF anhängen</w:t>
+        <w:t>Rechnung und Bestellung als PDF anhängen · nur die gelben Stellen ändern</w:t>
       </w:r>
     </w:p>
     <w:p>
@@ -1451,7 +1451,7 @@
           <w:color w:val="1A1A1A"/>
           <w:sz w:val="20"/>
         </w:rPr>
-        <w:t>Sie – Privatperson</w:t>
+        <w:t>1. Sie – Privatperson</w:t>
       </w:r>
     </w:p>
     <w:tbl>
@@ -1479,8 +1479,13 @@
                 <w:rFonts w:ascii="Arial" w:hAnsi="Arial"/>
                 <w:sz w:val="19"/>
               </w:rPr>
-              <w:t>Betreff: Ihre Bestellung Nr. [Vorgang] – Rechnung und Abholtermin</w:t>
+              <w:t>Betreff: Rechnung und Abholtermin – Kikripp Artikelkatalog</w:t>
             </w:r>
+          </w:p>
+          <w:p>
+            <w:pPr>
+              <w:spacing w:after="60"/>
+            </w:pPr>
           </w:p>
           <w:p>
             <w:pPr>
@@ -1491,7 +1496,29 @@
                 <w:rFonts w:ascii="Arial" w:hAnsi="Arial"/>
                 <w:sz w:val="19"/>
               </w:rPr>
+              <w:t xml:space="preserve">Guten Tag </w:t>
             </w:r>
+            <w:r>
+              <w:rPr>
+                <w:rFonts w:ascii="Arial" w:hAnsi="Arial"/>
+                <w:b/>
+                <w:sz w:val="19"/>
+                <w:highlight w:val="yellow"/>
+              </w:rPr>
+              <w:t>[Frau/Herr Nachname]</w:t>
+            </w:r>
+            <w:r>
+              <w:rPr>
+                <w:rFonts w:ascii="Arial" w:hAnsi="Arial"/>
+                <w:sz w:val="19"/>
+              </w:rPr>
+              <w:t>,</w:t>
+            </w:r>
+          </w:p>
+          <w:p>
+            <w:pPr>
+              <w:spacing w:after="60"/>
+            </w:pPr>
           </w:p>
           <w:p>
             <w:pPr>
@@ -1502,42 +1529,13 @@
                 <w:rFonts w:ascii="Arial" w:hAnsi="Arial"/>
                 <w:sz w:val="19"/>
               </w:rPr>
-              <w:t>Guten Tag [Frau/Herr Name],</w:t>
+              <w:t>vielen Dank für Ihre Reservierung aus unserem Artikelkatalog. Anbei erhalten Sie die Rechnung und Ihre Bestellung.</w:t>
             </w:r>
           </w:p>
           <w:p>
             <w:pPr>
               <w:spacing w:after="60"/>
             </w:pPr>
-            <w:r>
-              <w:rPr>
-                <w:rFonts w:ascii="Arial" w:hAnsi="Arial"/>
-                <w:sz w:val="19"/>
-              </w:rPr>
-            </w:r>
-          </w:p>
-          <w:p>
-            <w:pPr>
-              <w:spacing w:after="60"/>
-            </w:pPr>
-            <w:r>
-              <w:rPr>
-                <w:rFonts w:ascii="Arial" w:hAnsi="Arial"/>
-                <w:sz w:val="19"/>
-              </w:rPr>
-              <w:t>vielen Dank für Ihre Reservierung. Anbei erhalten Sie die Rechnung Nr. [Rechnungsnr.] und Ihre Bestellung.</w:t>
-            </w:r>
-          </w:p>
-          <w:p>
-            <w:pPr>
-              <w:spacing w:after="60"/>
-            </w:pPr>
-            <w:r>
-              <w:rPr>
-                <w:rFonts w:ascii="Arial" w:hAnsi="Arial"/>
-                <w:sz w:val="19"/>
-              </w:rPr>
-            </w:r>
           </w:p>
           <w:p>
             <w:pPr>
@@ -1555,11 +1553,33 @@
             <w:pPr>
               <w:spacing w:after="60"/>
             </w:pPr>
+          </w:p>
+          <w:p>
+            <w:pPr>
+              <w:spacing w:after="60"/>
+            </w:pPr>
             <w:r>
               <w:rPr>
                 <w:rFonts w:ascii="Arial" w:hAnsi="Arial"/>
                 <w:sz w:val="19"/>
               </w:rPr>
+              <w:t xml:space="preserve">Ihr Abholtermin: </w:t>
+            </w:r>
+            <w:r>
+              <w:rPr>
+                <w:rFonts w:ascii="Arial" w:hAnsi="Arial"/>
+                <w:b/>
+                <w:sz w:val="19"/>
+                <w:highlight w:val="yellow"/>
+              </w:rPr>
+              <w:t>[Wochentag, Datum, Uhrzeit]</w:t>
+            </w:r>
+            <w:r>
+              <w:rPr>
+                <w:rFonts w:ascii="Arial" w:hAnsi="Arial"/>
+                <w:sz w:val="19"/>
+              </w:rPr>
+              <w:t xml:space="preserve"> Uhr</w:t>
             </w:r>
           </w:p>
           <w:p>
@@ -1571,19 +1591,13 @@
                 <w:rFonts w:ascii="Arial" w:hAnsi="Arial"/>
                 <w:sz w:val="19"/>
               </w:rPr>
-              <w:t>Ihr Abholtermin am [Wochentag], [Datum] um [Uhrzeit] Uhr ist mit dem Zahlungseingang bestätigt – die Ware geben wir erst nach Zahlungseingang heraus.</w:t>
+              <w:t>Der Termin ist mit dem Zahlungseingang bestätigt – die Ware geben wir erst nach Zahlungseingang heraus.</w:t>
             </w:r>
           </w:p>
           <w:p>
             <w:pPr>
               <w:spacing w:after="60"/>
             </w:pPr>
-            <w:r>
-              <w:rPr>
-                <w:rFonts w:ascii="Arial" w:hAnsi="Arial"/>
-                <w:sz w:val="19"/>
-              </w:rPr>
-            </w:r>
           </w:p>
           <w:p>
             <w:pPr>
@@ -1625,12 +1639,6 @@
             <w:pPr>
               <w:spacing w:after="60"/>
             </w:pPr>
-            <w:r>
-              <w:rPr>
-                <w:rFonts w:ascii="Arial" w:hAnsi="Arial"/>
-                <w:sz w:val="19"/>
-              </w:rPr>
-            </w:r>
           </w:p>
           <w:p>
             <w:pPr>
@@ -1648,12 +1656,6 @@
             <w:pPr>
               <w:spacing w:after="60"/>
             </w:pPr>
-            <w:r>
-              <w:rPr>
-                <w:rFonts w:ascii="Arial" w:hAnsi="Arial"/>
-                <w:sz w:val="19"/>
-              </w:rPr>
-            </w:r>
           </w:p>
           <w:p>
             <w:pPr>
@@ -1671,12 +1673,6 @@
             <w:pPr>
               <w:spacing w:after="60"/>
             </w:pPr>
-            <w:r>
-              <w:rPr>
-                <w:rFonts w:ascii="Arial" w:hAnsi="Arial"/>
-                <w:sz w:val="19"/>
-              </w:rPr>
-            </w:r>
           </w:p>
           <w:p>
             <w:pPr>
@@ -1699,7 +1695,253 @@
                 <w:rFonts w:ascii="Arial" w:hAnsi="Arial"/>
                 <w:sz w:val="19"/>
               </w:rPr>
-              <w:t>[Name]</w:t>
+              <w:t>Jenny Preisigke</w:t>
+            </w:r>
+          </w:p>
+          <w:p>
+            <w:pPr>
+              <w:spacing w:after="60"/>
+            </w:pPr>
+            <w:r>
+              <w:rPr>
+                <w:rFonts w:ascii="Arial" w:hAnsi="Arial"/>
+                <w:sz w:val="19"/>
+              </w:rPr>
+              <w:t>Kikripp GmbH</w:t>
+            </w:r>
+          </w:p>
+        </w:tc>
+      </w:tr>
+    </w:tbl>
+    <w:p>
+      <w:r>
+        <w:br w:type="page"/>
+      </w:r>
+    </w:p>
+    <w:p>
+      <w:pPr>
+        <w:spacing w:before="120" w:after="40"/>
+      </w:pPr>
+      <w:r>
+        <w:rPr>
+          <w:rFonts w:ascii="Arial" w:hAnsi="Arial"/>
+          <w:b/>
+          <w:i w:val="0"/>
+          <w:color w:val="1A1A1A"/>
+          <w:sz w:val="20"/>
+        </w:rPr>
+        <w:t>2. Sie – Firma</w:t>
+      </w:r>
+    </w:p>
+    <w:tbl>
+      <w:tblPr>
+        <w:tblStyle w:val="TableGrid"/>
+        <w:tblW w:type="auto" w:w="0"/>
+        <w:tblLook w:firstColumn="1" w:firstRow="1" w:lastColumn="0" w:lastRow="0" w:noHBand="0" w:noVBand="1" w:val="04A0"/>
+      </w:tblPr>
+      <w:tblGrid>
+        <w:gridCol w:w="9518"/>
+      </w:tblGrid>
+      <w:tr>
+        <w:tc>
+          <w:tcPr>
+            <w:tcW w:type="dxa" w:w="9518"/>
+            <w:shd w:val="clear" w:color="auto" w:fill="F2F2F2"/>
+          </w:tcPr>
+          <w:p>
+            <w:pPr>
+              <w:spacing w:after="60"/>
+            </w:pPr>
+            <w:r/>
+            <w:r>
+              <w:rPr>
+                <w:rFonts w:ascii="Arial" w:hAnsi="Arial"/>
+                <w:sz w:val="19"/>
+              </w:rPr>
+              <w:t>Betreff: Rechnung und Abholtermin – Kikripp Artikelkatalog</w:t>
+            </w:r>
+          </w:p>
+          <w:p>
+            <w:pPr>
+              <w:spacing w:after="60"/>
+            </w:pPr>
+          </w:p>
+          <w:p>
+            <w:pPr>
+              <w:spacing w:after="60"/>
+            </w:pPr>
+            <w:r>
+              <w:rPr>
+                <w:rFonts w:ascii="Arial" w:hAnsi="Arial"/>
+                <w:sz w:val="19"/>
+              </w:rPr>
+              <w:t>Sehr geehrte Damen und Herren,</w:t>
+            </w:r>
+          </w:p>
+          <w:p>
+            <w:pPr>
+              <w:spacing w:after="60"/>
+            </w:pPr>
+          </w:p>
+          <w:p>
+            <w:pPr>
+              <w:spacing w:after="60"/>
+            </w:pPr>
+            <w:r>
+              <w:rPr>
+                <w:rFonts w:ascii="Arial" w:hAnsi="Arial"/>
+                <w:sz w:val="19"/>
+              </w:rPr>
+              <w:t>vielen Dank für Ihre Reservierung aus unserem Artikelkatalog. Anbei erhalten Sie die Rechnung und Ihre Bestellung.</w:t>
+            </w:r>
+          </w:p>
+          <w:p>
+            <w:pPr>
+              <w:spacing w:after="60"/>
+            </w:pPr>
+          </w:p>
+          <w:p>
+            <w:pPr>
+              <w:spacing w:after="60"/>
+            </w:pPr>
+            <w:r>
+              <w:rPr>
+                <w:rFonts w:ascii="Arial" w:hAnsi="Arial"/>
+                <w:sz w:val="19"/>
+              </w:rPr>
+              <w:t>Bitte überweisen Sie den Rechnungsbetrag zeitnah unter Angabe der Rechnungsnummer auf das angegebene Konto. Die Bestellung senden Sie uns bitte unterschrieben per Scan zurück oder unterschreiben sie bei der Abholung.</w:t>
+            </w:r>
+          </w:p>
+          <w:p>
+            <w:pPr>
+              <w:spacing w:after="60"/>
+            </w:pPr>
+          </w:p>
+          <w:p>
+            <w:pPr>
+              <w:spacing w:after="60"/>
+            </w:pPr>
+            <w:r>
+              <w:rPr>
+                <w:rFonts w:ascii="Arial" w:hAnsi="Arial"/>
+                <w:sz w:val="19"/>
+              </w:rPr>
+              <w:t xml:space="preserve">Ihr Abholtermin: </w:t>
+            </w:r>
+            <w:r>
+              <w:rPr>
+                <w:rFonts w:ascii="Arial" w:hAnsi="Arial"/>
+                <w:b/>
+                <w:sz w:val="19"/>
+                <w:highlight w:val="yellow"/>
+              </w:rPr>
+              <w:t>[Wochentag, Datum, Uhrzeit]</w:t>
+            </w:r>
+            <w:r>
+              <w:rPr>
+                <w:rFonts w:ascii="Arial" w:hAnsi="Arial"/>
+                <w:sz w:val="19"/>
+              </w:rPr>
+              <w:t xml:space="preserve"> Uhr</w:t>
+            </w:r>
+          </w:p>
+          <w:p>
+            <w:pPr>
+              <w:spacing w:after="60"/>
+            </w:pPr>
+            <w:r>
+              <w:rPr>
+                <w:rFonts w:ascii="Arial" w:hAnsi="Arial"/>
+                <w:sz w:val="19"/>
+              </w:rPr>
+              <w:t>Der Termin ist mit dem Zahlungseingang bestätigt – die Ware geben wir erst nach Zahlungseingang heraus.</w:t>
+            </w:r>
+          </w:p>
+          <w:p>
+            <w:pPr>
+              <w:spacing w:after="60"/>
+            </w:pPr>
+          </w:p>
+          <w:p>
+            <w:pPr>
+              <w:spacing w:after="60"/>
+            </w:pPr>
+            <w:r>
+              <w:rPr>
+                <w:rFonts w:ascii="Arial" w:hAnsi="Arial"/>
+                <w:sz w:val="19"/>
+              </w:rPr>
+              <w:t>Abholadresse: Hermann-Schwer-Str. 1, 78048 Villingen-Schwenningen</w:t>
+            </w:r>
+          </w:p>
+          <w:p>
+            <w:pPr>
+              <w:spacing w:after="60"/>
+            </w:pPr>
+            <w:r>
+              <w:rPr>
+                <w:rFonts w:ascii="Arial" w:hAnsi="Arial"/>
+                <w:sz w:val="19"/>
+              </w:rPr>
+              <w:t>Die Zufahrt ist nur über die Peterzeller Straße 8 möglich: am Firmengelände vorbei bis ans Ende durchfahren, das Gebäude liegt auf der rechten Seite.</w:t>
+            </w:r>
+          </w:p>
+          <w:p>
+            <w:pPr>
+              <w:spacing w:after="60"/>
+            </w:pPr>
+            <w:r>
+              <w:rPr>
+                <w:rFonts w:ascii="Arial" w:hAnsi="Arial"/>
+                <w:sz w:val="19"/>
+              </w:rPr>
+              <w:t>Bitte bringen Sie ausreichend Helfer, Werkzeug und ein passendes Fahrzeug mit.</w:t>
+            </w:r>
+          </w:p>
+          <w:p>
+            <w:pPr>
+              <w:spacing w:after="60"/>
+            </w:pPr>
+          </w:p>
+          <w:p>
+            <w:pPr>
+              <w:spacing w:after="60"/>
+            </w:pPr>
+            <w:r>
+              <w:rPr>
+                <w:rFonts w:ascii="Arial" w:hAnsi="Arial"/>
+                <w:sz w:val="19"/>
+              </w:rPr>
+              <w:t>Bei Fragen erreichen Sie uns unter 07725 5179702 oder saldi4kids@outlook.com.</w:t>
+            </w:r>
+          </w:p>
+          <w:p>
+            <w:pPr>
+              <w:spacing w:after="60"/>
+            </w:pPr>
+          </w:p>
+          <w:p>
+            <w:pPr>
+              <w:spacing w:after="60"/>
+            </w:pPr>
+            <w:r>
+              <w:rPr>
+                <w:rFonts w:ascii="Arial" w:hAnsi="Arial"/>
+                <w:sz w:val="19"/>
+              </w:rPr>
+              <w:t>Mit freundlichen Grüßen</w:t>
+            </w:r>
+          </w:p>
+          <w:p>
+            <w:pPr>
+              <w:spacing w:after="60"/>
+            </w:pPr>
+            <w:r>
+              <w:rPr>
+                <w:rFonts w:ascii="Arial" w:hAnsi="Arial"/>
+                <w:sz w:val="19"/>
+              </w:rPr>
+              <w:t>Jenny Preisigke</w:t>
             </w:r>
           </w:p>
           <w:p>
@@ -1729,7 +1971,7 @@
           <w:color w:val="1A1A1A"/>
           <w:sz w:val="20"/>
         </w:rPr>
-        <w:t>Du – Privatperson</w:t>
+        <w:t>3. Du – Privatperson</w:t>
       </w:r>
     </w:p>
     <w:tbl>
@@ -1757,8 +1999,13 @@
                 <w:rFonts w:ascii="Arial" w:hAnsi="Arial"/>
                 <w:sz w:val="19"/>
               </w:rPr>
-              <w:t>Betreff: Deine Bestellung Nr. [Vorgang] – Rechnung und Abholtermin</w:t>
+              <w:t>Betreff: Rechnung und Abholtermin – Kikripp Artikelkatalog</w:t>
             </w:r>
+          </w:p>
+          <w:p>
+            <w:pPr>
+              <w:spacing w:after="60"/>
+            </w:pPr>
           </w:p>
           <w:p>
             <w:pPr>
@@ -1769,7 +2016,29 @@
                 <w:rFonts w:ascii="Arial" w:hAnsi="Arial"/>
                 <w:sz w:val="19"/>
               </w:rPr>
+              <w:t xml:space="preserve">Hallo </w:t>
             </w:r>
+            <w:r>
+              <w:rPr>
+                <w:rFonts w:ascii="Arial" w:hAnsi="Arial"/>
+                <w:b/>
+                <w:sz w:val="19"/>
+                <w:highlight w:val="yellow"/>
+              </w:rPr>
+              <w:t>[Vorname]</w:t>
+            </w:r>
+            <w:r>
+              <w:rPr>
+                <w:rFonts w:ascii="Arial" w:hAnsi="Arial"/>
+                <w:sz w:val="19"/>
+              </w:rPr>
+              <w:t>,</w:t>
+            </w:r>
+          </w:p>
+          <w:p>
+            <w:pPr>
+              <w:spacing w:after="60"/>
+            </w:pPr>
           </w:p>
           <w:p>
             <w:pPr>
@@ -1780,42 +2049,13 @@
                 <w:rFonts w:ascii="Arial" w:hAnsi="Arial"/>
                 <w:sz w:val="19"/>
               </w:rPr>
-              <w:t>Hallo [Vorname],</w:t>
+              <w:t>vielen Dank für deine Reservierung! Anbei findest du die Rechnung und deine Bestellung.</w:t>
             </w:r>
           </w:p>
           <w:p>
             <w:pPr>
               <w:spacing w:after="60"/>
             </w:pPr>
-            <w:r>
-              <w:rPr>
-                <w:rFonts w:ascii="Arial" w:hAnsi="Arial"/>
-                <w:sz w:val="19"/>
-              </w:rPr>
-            </w:r>
-          </w:p>
-          <w:p>
-            <w:pPr>
-              <w:spacing w:after="60"/>
-            </w:pPr>
-            <w:r>
-              <w:rPr>
-                <w:rFonts w:ascii="Arial" w:hAnsi="Arial"/>
-                <w:sz w:val="19"/>
-              </w:rPr>
-              <w:t>vielen Dank für deine Reservierung! Anbei findest du die Rechnung Nr. [Rechnungsnr.] und deine Bestellung.</w:t>
-            </w:r>
-          </w:p>
-          <w:p>
-            <w:pPr>
-              <w:spacing w:after="60"/>
-            </w:pPr>
-            <w:r>
-              <w:rPr>
-                <w:rFonts w:ascii="Arial" w:hAnsi="Arial"/>
-                <w:sz w:val="19"/>
-              </w:rPr>
-            </w:r>
           </w:p>
           <w:p>
             <w:pPr>
@@ -1833,11 +2073,33 @@
             <w:pPr>
               <w:spacing w:after="60"/>
             </w:pPr>
+          </w:p>
+          <w:p>
+            <w:pPr>
+              <w:spacing w:after="60"/>
+            </w:pPr>
             <w:r>
               <w:rPr>
                 <w:rFonts w:ascii="Arial" w:hAnsi="Arial"/>
                 <w:sz w:val="19"/>
               </w:rPr>
+              <w:t xml:space="preserve">Dein Abholtermin: </w:t>
+            </w:r>
+            <w:r>
+              <w:rPr>
+                <w:rFonts w:ascii="Arial" w:hAnsi="Arial"/>
+                <w:b/>
+                <w:sz w:val="19"/>
+                <w:highlight w:val="yellow"/>
+              </w:rPr>
+              <w:t>[Wochentag, Datum, Uhrzeit]</w:t>
+            </w:r>
+            <w:r>
+              <w:rPr>
+                <w:rFonts w:ascii="Arial" w:hAnsi="Arial"/>
+                <w:sz w:val="19"/>
+              </w:rPr>
+              <w:t xml:space="preserve"> Uhr</w:t>
             </w:r>
           </w:p>
           <w:p>
@@ -1849,19 +2111,13 @@
                 <w:rFonts w:ascii="Arial" w:hAnsi="Arial"/>
                 <w:sz w:val="19"/>
               </w:rPr>
-              <w:t>Dein Abholtermin am [Wochentag], [Datum] um [Uhrzeit] Uhr ist mit dem Zahlungseingang bestätigt – die Ware geben wir erst nach Zahlungseingang heraus.</w:t>
+              <w:t>Der Termin ist mit dem Zahlungseingang bestätigt – die Ware geben wir erst nach Zahlungseingang heraus.</w:t>
             </w:r>
           </w:p>
           <w:p>
             <w:pPr>
               <w:spacing w:after="60"/>
             </w:pPr>
-            <w:r>
-              <w:rPr>
-                <w:rFonts w:ascii="Arial" w:hAnsi="Arial"/>
-                <w:sz w:val="19"/>
-              </w:rPr>
-            </w:r>
           </w:p>
           <w:p>
             <w:pPr>
@@ -1903,12 +2159,6 @@
             <w:pPr>
               <w:spacing w:after="60"/>
             </w:pPr>
-            <w:r>
-              <w:rPr>
-                <w:rFonts w:ascii="Arial" w:hAnsi="Arial"/>
-                <w:sz w:val="19"/>
-              </w:rPr>
-            </w:r>
           </w:p>
           <w:p>
             <w:pPr>
@@ -1926,12 +2176,6 @@
             <w:pPr>
               <w:spacing w:after="60"/>
             </w:pPr>
-            <w:r>
-              <w:rPr>
-                <w:rFonts w:ascii="Arial" w:hAnsi="Arial"/>
-                <w:sz w:val="19"/>
-              </w:rPr>
-            </w:r>
           </w:p>
           <w:p>
             <w:pPr>
@@ -1949,12 +2193,6 @@
             <w:pPr>
               <w:spacing w:after="60"/>
             </w:pPr>
-            <w:r>
-              <w:rPr>
-                <w:rFonts w:ascii="Arial" w:hAnsi="Arial"/>
-                <w:sz w:val="19"/>
-              </w:rPr>
-            </w:r>
           </w:p>
           <w:p>
             <w:pPr>
@@ -1977,7 +2215,7 @@
                 <w:rFonts w:ascii="Arial" w:hAnsi="Arial"/>
                 <w:sz w:val="19"/>
               </w:rPr>
-              <w:t>[Name]</w:t>
+              <w:t>Jenny Preisigke</w:t>
             </w:r>
           </w:p>
           <w:p>
@@ -1996,6 +2234,11 @@
       </w:tr>
     </w:tbl>
     <w:p>
+      <w:r>
+        <w:br w:type="page"/>
+      </w:r>
+    </w:p>
+    <w:p>
       <w:pPr>
         <w:spacing w:before="120" w:after="40"/>
       </w:pPr>
@@ -2007,7 +2250,7 @@
           <w:color w:val="1A1A1A"/>
           <w:sz w:val="20"/>
         </w:rPr>
-        <w:t>Unternehmen (ohne Widerrufsbelehrung – Firmen haben kein Widerrufsrecht)</w:t>
+        <w:t>4. Du – Firma (ihr-Form, ohne Widerrufsbelehrung)</w:t>
       </w:r>
     </w:p>
     <w:tbl>
@@ -2035,7 +2278,91 @@
                 <w:rFonts w:ascii="Arial" w:hAnsi="Arial"/>
                 <w:sz w:val="19"/>
               </w:rPr>
-              <w:t>Betreff: Ihre Bestellung Nr. [Vorgang] – Rechnung und Abholtermin</w:t>
+              <w:t>Betreff: Rechnung und Abholtermin – Kikripp Artikelkatalog</w:t>
+            </w:r>
+          </w:p>
+          <w:p>
+            <w:pPr>
+              <w:spacing w:after="60"/>
+            </w:pPr>
+          </w:p>
+          <w:p>
+            <w:pPr>
+              <w:spacing w:after="60"/>
+            </w:pPr>
+            <w:r>
+              <w:rPr>
+                <w:rFonts w:ascii="Arial" w:hAnsi="Arial"/>
+                <w:sz w:val="19"/>
+              </w:rPr>
+              <w:t>Hallo zusammen,</w:t>
+            </w:r>
+          </w:p>
+          <w:p>
+            <w:pPr>
+              <w:spacing w:after="60"/>
+            </w:pPr>
+          </w:p>
+          <w:p>
+            <w:pPr>
+              <w:spacing w:after="60"/>
+            </w:pPr>
+            <w:r>
+              <w:rPr>
+                <w:rFonts w:ascii="Arial" w:hAnsi="Arial"/>
+                <w:sz w:val="19"/>
+              </w:rPr>
+              <w:t>vielen Dank für eure Reservierung! Anbei findet ihr die Rechnung und eure Bestellung.</w:t>
+            </w:r>
+          </w:p>
+          <w:p>
+            <w:pPr>
+              <w:spacing w:after="60"/>
+            </w:pPr>
+          </w:p>
+          <w:p>
+            <w:pPr>
+              <w:spacing w:after="60"/>
+            </w:pPr>
+            <w:r>
+              <w:rPr>
+                <w:rFonts w:ascii="Arial" w:hAnsi="Arial"/>
+                <w:sz w:val="19"/>
+              </w:rPr>
+              <w:t>Bitte überweist den Rechnungsbetrag zeitnah unter Angabe der Rechnungsnummer auf das angegebene Konto. Die Bestellung schickt ihr uns bitte unterschrieben per Scan zurück oder unterschreibt sie bei der Abholung.</w:t>
+            </w:r>
+          </w:p>
+          <w:p>
+            <w:pPr>
+              <w:spacing w:after="60"/>
+            </w:pPr>
+          </w:p>
+          <w:p>
+            <w:pPr>
+              <w:spacing w:after="60"/>
+            </w:pPr>
+            <w:r>
+              <w:rPr>
+                <w:rFonts w:ascii="Arial" w:hAnsi="Arial"/>
+                <w:sz w:val="19"/>
+              </w:rPr>
+              <w:t xml:space="preserve">Euer Abholtermin: </w:t>
+            </w:r>
+            <w:r>
+              <w:rPr>
+                <w:rFonts w:ascii="Arial" w:hAnsi="Arial"/>
+                <w:b/>
+                <w:sz w:val="19"/>
+                <w:highlight w:val="yellow"/>
+              </w:rPr>
+              <w:t>[Wochentag, Datum, Uhrzeit]</w:t>
+            </w:r>
+            <w:r>
+              <w:rPr>
+                <w:rFonts w:ascii="Arial" w:hAnsi="Arial"/>
+                <w:sz w:val="19"/>
+              </w:rPr>
+              <w:t xml:space="preserve"> Uhr</w:t>
             </w:r>
           </w:p>
           <w:p>
@@ -2047,99 +2374,13 @@
                 <w:rFonts w:ascii="Arial" w:hAnsi="Arial"/>
                 <w:sz w:val="19"/>
               </w:rPr>
+              <w:t>Der Termin ist mit dem Zahlungseingang bestätigt – die Ware geben wir erst nach Zahlungseingang heraus.</w:t>
             </w:r>
           </w:p>
           <w:p>
             <w:pPr>
               <w:spacing w:after="60"/>
             </w:pPr>
-            <w:r>
-              <w:rPr>
-                <w:rFonts w:ascii="Arial" w:hAnsi="Arial"/>
-                <w:sz w:val="19"/>
-              </w:rPr>
-              <w:t>Sehr geehrte Damen und Herren, / Guten Tag [Frau/Herr Name],</w:t>
-            </w:r>
-          </w:p>
-          <w:p>
-            <w:pPr>
-              <w:spacing w:after="60"/>
-            </w:pPr>
-            <w:r>
-              <w:rPr>
-                <w:rFonts w:ascii="Arial" w:hAnsi="Arial"/>
-                <w:sz w:val="19"/>
-              </w:rPr>
-            </w:r>
-          </w:p>
-          <w:p>
-            <w:pPr>
-              <w:spacing w:after="60"/>
-            </w:pPr>
-            <w:r>
-              <w:rPr>
-                <w:rFonts w:ascii="Arial" w:hAnsi="Arial"/>
-                <w:sz w:val="19"/>
-              </w:rPr>
-              <w:t>vielen Dank für Ihre Reservierung aus unserem Artikelkatalog. Anbei erhalten Sie die Rechnung Nr. [Rechnungsnr.] und die Bestellung für [Firma].</w:t>
-            </w:r>
-          </w:p>
-          <w:p>
-            <w:pPr>
-              <w:spacing w:after="60"/>
-            </w:pPr>
-            <w:r>
-              <w:rPr>
-                <w:rFonts w:ascii="Arial" w:hAnsi="Arial"/>
-                <w:sz w:val="19"/>
-              </w:rPr>
-            </w:r>
-          </w:p>
-          <w:p>
-            <w:pPr>
-              <w:spacing w:after="60"/>
-            </w:pPr>
-            <w:r>
-              <w:rPr>
-                <w:rFonts w:ascii="Arial" w:hAnsi="Arial"/>
-                <w:sz w:val="19"/>
-              </w:rPr>
-              <w:t>Bitte überweisen Sie den Rechnungsbetrag zeitnah unter Angabe der Rechnungsnummer auf das angegebene Konto. Die Bestellung senden Sie uns bitte unterschrieben per Scan zurück oder unterschreiben sie bei der Abholung.</w:t>
-            </w:r>
-          </w:p>
-          <w:p>
-            <w:pPr>
-              <w:spacing w:after="60"/>
-            </w:pPr>
-            <w:r>
-              <w:rPr>
-                <w:rFonts w:ascii="Arial" w:hAnsi="Arial"/>
-                <w:sz w:val="19"/>
-              </w:rPr>
-            </w:r>
-          </w:p>
-          <w:p>
-            <w:pPr>
-              <w:spacing w:after="60"/>
-            </w:pPr>
-            <w:r>
-              <w:rPr>
-                <w:rFonts w:ascii="Arial" w:hAnsi="Arial"/>
-                <w:sz w:val="19"/>
-              </w:rPr>
-              <w:t>Ihr Abholtermin am [Wochentag], [Datum] um [Uhrzeit] Uhr ist mit dem Zahlungseingang bestätigt – die Ware geben wir erst nach Zahlungseingang heraus.</w:t>
-            </w:r>
-          </w:p>
-          <w:p>
-            <w:pPr>
-              <w:spacing w:after="60"/>
-            </w:pPr>
-            <w:r>
-              <w:rPr>
-                <w:rFonts w:ascii="Arial" w:hAnsi="Arial"/>
-                <w:sz w:val="19"/>
-              </w:rPr>
-            </w:r>
           </w:p>
           <w:p>
             <w:pPr>
@@ -2174,7 +2415,41 @@
                 <w:rFonts w:ascii="Arial" w:hAnsi="Arial"/>
                 <w:sz w:val="19"/>
               </w:rPr>
-              <w:t>Bitte bringen Sie ausreichend Helfer, Werkzeug und ein passendes Fahrzeug mit.</w:t>
+              <w:t>Bitte bringt ausreichend Helfer, Werkzeug und ein passendes Fahrzeug mit.</w:t>
+            </w:r>
+          </w:p>
+          <w:p>
+            <w:pPr>
+              <w:spacing w:after="60"/>
+            </w:pPr>
+          </w:p>
+          <w:p>
+            <w:pPr>
+              <w:spacing w:after="60"/>
+            </w:pPr>
+            <w:r>
+              <w:rPr>
+                <w:rFonts w:ascii="Arial" w:hAnsi="Arial"/>
+                <w:sz w:val="19"/>
+              </w:rPr>
+              <w:t>Bei Fragen erreicht ihr uns unter 07725 5179702 oder saldi4kids@outlook.com.</w:t>
+            </w:r>
+          </w:p>
+          <w:p>
+            <w:pPr>
+              <w:spacing w:after="60"/>
+            </w:pPr>
+          </w:p>
+          <w:p>
+            <w:pPr>
+              <w:spacing w:after="60"/>
+            </w:pPr>
+            <w:r>
+              <w:rPr>
+                <w:rFonts w:ascii="Arial" w:hAnsi="Arial"/>
+                <w:sz w:val="19"/>
+              </w:rPr>
+              <w:t>Viele Grüße</w:t>
             </w:r>
           </w:p>
           <w:p>
@@ -2186,53 +2461,7 @@
                 <w:rFonts w:ascii="Arial" w:hAnsi="Arial"/>
                 <w:sz w:val="19"/>
               </w:rPr>
-            </w:r>
-          </w:p>
-          <w:p>
-            <w:pPr>
-              <w:spacing w:after="60"/>
-            </w:pPr>
-            <w:r>
-              <w:rPr>
-                <w:rFonts w:ascii="Arial" w:hAnsi="Arial"/>
-                <w:sz w:val="19"/>
-              </w:rPr>
-              <w:t>Bei Fragen erreichen Sie uns unter 07725 5179702 oder saldi4kids@outlook.com.</w:t>
-            </w:r>
-          </w:p>
-          <w:p>
-            <w:pPr>
-              <w:spacing w:after="60"/>
-            </w:pPr>
-            <w:r>
-              <w:rPr>
-                <w:rFonts w:ascii="Arial" w:hAnsi="Arial"/>
-                <w:sz w:val="19"/>
-              </w:rPr>
-            </w:r>
-          </w:p>
-          <w:p>
-            <w:pPr>
-              <w:spacing w:after="60"/>
-            </w:pPr>
-            <w:r>
-              <w:rPr>
-                <w:rFonts w:ascii="Arial" w:hAnsi="Arial"/>
-                <w:sz w:val="19"/>
-              </w:rPr>
-              <w:t>Mit freundlichen Grüßen</w:t>
-            </w:r>
-          </w:p>
-          <w:p>
-            <w:pPr>
-              <w:spacing w:after="60"/>
-            </w:pPr>
-            <w:r>
-              <w:rPr>
-                <w:rFonts w:ascii="Arial" w:hAnsi="Arial"/>
-                <w:sz w:val="19"/>
-              </w:rPr>
-              <w:t>[Name]</w:t>
+              <w:t>Jenny Preisigke</w:t>
             </w:r>
           </w:p>
           <w:p>
@@ -2250,6 +2479,21 @@
         </w:tc>
       </w:tr>
     </w:tbl>
+    <w:p>
+      <w:pPr>
+        <w:spacing w:before="80" w:after="140"/>
+      </w:pPr>
+      <w:r>
+        <w:rPr>
+          <w:rFonts w:ascii="Arial" w:hAnsi="Arial"/>
+          <w:b w:val="0"/>
+          <w:i/>
+          <w:color w:val="1A1A1A"/>
+          <w:sz w:val="19"/>
+        </w:rPr>
+        <w:t>Firmen haben kein Widerrufsrecht – deshalb fehlt dort der Satz zur Widerrufsbelehrung.</w:t>
+      </w:r>
+    </w:p>
     <w:sectPr>
       <w:pgSz w:w="12240" w:h="15840"/>
       <w:pgMar w:top="1247" w:right="1361" w:bottom="1134" w:left="1361" w:header="720" w:footer="720" w:gutter="0"/>

</xml_diff>

<commit_message>
Plugin 1.3.0: Abholplan, Outlook-Termine, Zu erledigen, Mail-Knopf, Rechnungsnummer und abgeholt am Vorgang, Reiter, Kennzahlen
Co-Authored-By: Claude Opus 5.5 <noreply@anthropic.com>
Claude-Session: https://claude.ai/code/session_01576f22PxULmPRwq5ayso6w
</commit_message>
<xml_diff>
--- a/ausgabe/S2_Verkauf_Ablauf_und_Texte.docx
+++ b/ausgabe/S2_Verkauf_Ablauf_und_Texte.docx
@@ -195,7 +195,7 @@
                 <w:color w:val="1A1A1A"/>
                 <w:sz w:val="19"/>
               </w:rPr>
-              <w:t>Mail kommt an, Vorgang steht unter Artikelkatalog → Reservierungen. Innerhalb von 3 Werktagen beim Interessenten melden.</w:t>
+              <w:t>WordPress → Artikelkatalog → Reservierungen. „Zu erledigen“ zeigt, was dran ist. Innerhalb von 3 Werktagen beim Interessenten melden.</w:t>
             </w:r>
           </w:p>
         </w:tc>
@@ -257,7 +257,7 @@
                 <w:color w:val="1A1A1A"/>
                 <w:sz w:val="19"/>
               </w:rPr>
-              <w:t>WordPress: „bestellt“ klicken und Abholtermin eintragen. Sonst läuft die Reservierung nach 3 Werktagen ab und die Ware steht wieder im Katalog.</w:t>
+              <w:t>„bestellt“ klicken. In der grauen Zeile den Abholtermin bestätigen (Wunsch ist vorbelegt), ggf. „per Du“ – Speichern.</w:t>
             </w:r>
           </w:p>
         </w:tc>
@@ -319,7 +319,7 @@
                 <w:color w:val="1A1A1A"/>
                 <w:sz w:val="19"/>
               </w:rPr>
-              <w:t>„Bestellung erstellen: Unternehmen“ oder „Privatperson“ → als PDF speichern. Nicht drucken – sie geht per Mail mit.</w:t>
+              <w:t>„Bestellung erstellen“ – die passende Fassung ist fett – als PDF speichern.</w:t>
             </w:r>
           </w:p>
         </w:tc>
@@ -381,7 +381,7 @@
                 <w:color w:val="1A1A1A"/>
                 <w:sz w:val="19"/>
               </w:rPr>
-              <w:t>In DATEV Auftragswesen mit dem Artikel „Verkauf Webkatalog“ und den Textbausteinen auf Seite 2. Leistungsdatum = Abholtag.</w:t>
+              <w:t>In DATEV mit dem Artikel „Verkauf Webkatalog“. Rechnungsnr. und Datum in WordPress eintragen – Speichern.</w:t>
             </w:r>
           </w:p>
         </w:tc>
@@ -443,7 +443,7 @@
                 <w:color w:val="1A1A1A"/>
                 <w:sz w:val="19"/>
               </w:rPr>
-              <w:t>Rechnung und Bestellung als PDF anhängen, Vorlage auf Seite 3.</w:t>
+              <w:t>„✉ Mail schreiben“: Outlook öffnet sich mit fertigem Text. Rechnung und Bestellung anhängen, senden.</w:t>
             </w:r>
           </w:p>
         </w:tc>
@@ -485,7 +485,7 @@
                 <w:color w:val="1A1A1A"/>
                 <w:sz w:val="19"/>
               </w:rPr>
-              <w:t>6. Listen</w:t>
+              <w:t>6. Kalender</w:t>
             </w:r>
           </w:p>
         </w:tc>
@@ -505,7 +505,7 @@
                 <w:color w:val="1A1A1A"/>
                 <w:sz w:val="19"/>
               </w:rPr>
-              <w:t>Excel „Rechnungen (DATEV)“: Zeile mit Rechnungsnr. und „geschrieben am“. Abholübersicht: je Artikel eine Zeile mit Abholtag und Uhrzeit.</w:t>
+              <w:t>„📅 In Outlook eintragen“ → Datei öffnen → Importieren. Erinnerung am Werktag davor um 14 Uhr und 15 Minuten vor der Abholung.</w:t>
             </w:r>
           </w:p>
         </w:tc>
@@ -567,7 +567,7 @@
                 <w:color w:val="1A1A1A"/>
                 <w:sz w:val="19"/>
               </w:rPr>
-              <w:t>WordPress: „bezahlt“. Excel: „bezahlt am“. Abholübersicht: bezahlt = ja.</w:t>
+              <w:t>„bezahlt“ klicken. Kommt nichts, steht nach 5 Tagen „Zahlungserinnerung“ unter „Zu erledigen“.</w:t>
             </w:r>
           </w:p>
         </w:tc>
@@ -629,7 +629,7 @@
                 <w:color w:val="1A1A1A"/>
                 <w:sz w:val="19"/>
               </w:rPr>
-              <w:t>Abholübersicht nach Abholtag filtern, drucken, Ware bereitstellen und mit Zettel „Name + Vorgangsnummer“ markieren. Bestellung 2× drucken.</w:t>
+              <w:t>Artikelkatalog → Abholplan → „Tag drucken“. Ware bereitstellen, mit Name + Vorgangsnummer markieren. Bestellung 2× drucken.</w:t>
             </w:r>
           </w:p>
         </w:tc>
@@ -691,7 +691,7 @@
                 <w:color w:val="1A1A1A"/>
                 <w:sz w:val="19"/>
               </w:rPr>
-              <w:t>Nur gegen bezahlte Rechnung herausgeben. Beide Exemplare unterschreiben lassen, eins geht mit. Abholübersicht: abgeholt = ja.</w:t>
+              <w:t>Nur gegen bezahlte Rechnung. Beide Exemplare unterschreiben lassen, eins geht mit. „✓ abgeholt“ klicken.</w:t>
             </w:r>
           </w:p>
         </w:tc>
@@ -753,7 +753,7 @@
                 <w:color w:val="1A1A1A"/>
                 <w:sz w:val="19"/>
               </w:rPr>
-              <w:t>Mappe je Vorgang: Bestellung, Rechnung, Zahlungseingang. Kontaktdaten in WordPress löschen – bei Privatpersonen erst 14 Tage nach der Abholung (Widerrufsfrist).</w:t>
+              <w:t>Mappe je Vorgang: Bestellung, Rechnung, Zahlungseingang. Kontaktdaten löschen, wenn „Zu erledigen“ daran erinnert (Privatpersonen: 14 Tage nach der Abholung).</w:t>
             </w:r>
           </w:p>
         </w:tc>
@@ -815,7 +815,7 @@
                 <w:color w:val="1A1A1A"/>
                 <w:sz w:val="19"/>
               </w:rPr>
-              <w:t>Unter Artikelkatalog → Reservierungen die CSV herunterladen und an Claude schicken, zusammen mit der Excel-Artikelstammliste.</w:t>
+              <w:t>Reservierungen → „Alle Reservierungen als CSV exportieren“ und mit der Artikelstammliste an Claude schicken – Rechnungsnummern und Abholungen kommen dann automatisch in die Liste.</w:t>
             </w:r>
           </w:p>
         </w:tc>

</xml_diff>